<commit_message>
feat: expand edit song modals for better chord editing
</commit_message>
<xml_diff>
--- a/backend/test_output.docx
+++ b/backend/test_output.docx
@@ -45,7 +45,7 @@
       <w:pPr>
         <w:pStyle w:val="Ttulo1"/>
       </w:pPr>
-      <w:bookmarkStart w:id="0" w:name="_Toc224142745"/>
+      <w:bookmarkStart w:id="0" w:name="_Toc224192097"/>
       <w:r>
         <w:lastRenderedPageBreak/>
         <w:t>Sumário</w:t>
@@ -80,7 +80,7 @@
         </w:rPr>
         <w:fldChar w:fldCharType="separate"/>
       </w:r>
-      <w:hyperlink w:anchor="_Toc224142745" w:history="1">
+      <w:hyperlink w:anchor="_Toc224192097" w:history="1">
         <w:r>
           <w:rPr>
             <w:rStyle w:val="Hyperlink"/>
@@ -107,7 +107,7 @@
             <w:noProof/>
             <w:webHidden/>
           </w:rPr>
-          <w:instrText xml:space="preserve"> PAGEREF _Toc224142745 \h </w:instrText>
+          <w:instrText xml:space="preserve"> PAGEREF _Toc224192097 \h </w:instrText>
         </w:r>
         <w:r>
           <w:rPr>
@@ -154,7 +154,7 @@
           <w14:ligatures w14:val="standardContextual"/>
         </w:rPr>
       </w:pPr>
-      <w:hyperlink w:anchor="_Toc224142746" w:history="1">
+      <w:hyperlink w:anchor="_Toc224192098" w:history="1">
         <w:r>
           <w:rPr>
             <w:rStyle w:val="Hyperlink"/>
@@ -181,7 +181,7 @@
             <w:noProof/>
             <w:webHidden/>
           </w:rPr>
-          <w:instrText xml:space="preserve"> PAGEREF _Toc224142746 \h </w:instrText>
+          <w:instrText xml:space="preserve"> PAGEREF _Toc224192098 \h </w:instrText>
         </w:r>
         <w:r>
           <w:rPr>
@@ -228,7 +228,7 @@
           <w14:ligatures w14:val="standardContextual"/>
         </w:rPr>
       </w:pPr>
-      <w:hyperlink w:anchor="_Toc224142747" w:history="1">
+      <w:hyperlink w:anchor="_Toc224192099" w:history="1">
         <w:r>
           <w:rPr>
             <w:rStyle w:val="Hyperlink"/>
@@ -255,7 +255,7 @@
             <w:noProof/>
             <w:webHidden/>
           </w:rPr>
-          <w:instrText xml:space="preserve"> PAGEREF _Toc224142747 \h </w:instrText>
+          <w:instrText xml:space="preserve"> PAGEREF _Toc224192099 \h </w:instrText>
         </w:r>
         <w:r>
           <w:rPr>
@@ -325,7 +325,7 @@
         <w:pStyle w:val="Ttulo1"/>
         <w:spacing w:before="0" w:after="40"/>
       </w:pPr>
-      <w:bookmarkStart w:id="1" w:name="_Toc224142746"/>
+      <w:bookmarkStart w:id="1" w:name="_Toc224192098"/>
       <w:r>
         <w:lastRenderedPageBreak/>
         <w:t>Song 1 - Artist 1</w:t>
@@ -443,7 +443,7 @@
               </w:rPr>
               <w:lastRenderedPageBreak/>
               <w:drawing>
-                <wp:inline distT="0" distB="0" distL="0" distR="0" wp14:anchorId="5A1FDE91" wp14:editId="13AA5617">
+                <wp:inline distT="0" distB="0" distL="0" distR="0" wp14:anchorId="38166D92" wp14:editId="4F765DC5">
                   <wp:extent cx="621792" cy="829056"/>
                   <wp:effectExtent l="0" t="0" r="0" b="0"/>
                   <wp:docPr id="1" name="Picture 1"/>
@@ -496,7 +496,7 @@
                 <w:noProof/>
               </w:rPr>
               <w:drawing>
-                <wp:inline distT="0" distB="0" distL="0" distR="0" wp14:anchorId="08B57C09" wp14:editId="35642A48">
+                <wp:inline distT="0" distB="0" distL="0" distR="0" wp14:anchorId="0AF81F58" wp14:editId="6BD71F19">
                   <wp:extent cx="621792" cy="829056"/>
                   <wp:effectExtent l="0" t="0" r="0" b="0"/>
                   <wp:docPr id="2" name="Picture 2"/>
@@ -549,7 +549,7 @@
                 <w:noProof/>
               </w:rPr>
               <w:drawing>
-                <wp:inline distT="0" distB="0" distL="0" distR="0" wp14:anchorId="5EB6CACB" wp14:editId="258EC841">
+                <wp:inline distT="0" distB="0" distL="0" distR="0" wp14:anchorId="36D101C3" wp14:editId="0B3D5D1A">
                   <wp:extent cx="621792" cy="829056"/>
                   <wp:effectExtent l="0" t="0" r="0" b="0"/>
                   <wp:docPr id="3" name="Picture 3"/>
@@ -602,7 +602,7 @@
                 <w:noProof/>
               </w:rPr>
               <w:drawing>
-                <wp:inline distT="0" distB="0" distL="0" distR="0" wp14:anchorId="71A53EC6" wp14:editId="6B6637F9">
+                <wp:inline distT="0" distB="0" distL="0" distR="0" wp14:anchorId="4C2957F5" wp14:editId="69201D9B">
                   <wp:extent cx="621792" cy="829056"/>
                   <wp:effectExtent l="0" t="0" r="0" b="0"/>
                   <wp:docPr id="4" name="Picture 4"/>
@@ -659,7 +659,7 @@
         <w:pStyle w:val="Ttulo1"/>
         <w:spacing w:before="0" w:after="40"/>
       </w:pPr>
-      <w:bookmarkStart w:id="2" w:name="_Toc224142747"/>
+      <w:bookmarkStart w:id="2" w:name="_Toc224192099"/>
       <w:r>
         <w:lastRenderedPageBreak/>
         <w:t>Song 2 - Artist 2</w:t>
@@ -777,7 +777,7 @@
               </w:rPr>
               <w:lastRenderedPageBreak/>
               <w:drawing>
-                <wp:inline distT="0" distB="0" distL="0" distR="0" wp14:anchorId="4B7E4A03" wp14:editId="46EA26FD">
+                <wp:inline distT="0" distB="0" distL="0" distR="0" wp14:anchorId="101CA7B7" wp14:editId="365ADA3E">
                   <wp:extent cx="621792" cy="829056"/>
                   <wp:effectExtent l="0" t="0" r="0" b="0"/>
                   <wp:docPr id="5" name="Picture 5"/>
@@ -830,7 +830,7 @@
                 <w:noProof/>
               </w:rPr>
               <w:drawing>
-                <wp:inline distT="0" distB="0" distL="0" distR="0" wp14:anchorId="1FE67FD8" wp14:editId="68C34354">
+                <wp:inline distT="0" distB="0" distL="0" distR="0" wp14:anchorId="5673504B" wp14:editId="20DC29EF">
                   <wp:extent cx="621792" cy="829056"/>
                   <wp:effectExtent l="0" t="0" r="0" b="0"/>
                   <wp:docPr id="6" name="Picture 6"/>
@@ -883,7 +883,7 @@
                 <w:noProof/>
               </w:rPr>
               <w:drawing>
-                <wp:inline distT="0" distB="0" distL="0" distR="0" wp14:anchorId="25FAE0C2" wp14:editId="248D33E4">
+                <wp:inline distT="0" distB="0" distL="0" distR="0" wp14:anchorId="394183C0" wp14:editId="216832FF">
                   <wp:extent cx="621792" cy="829056"/>
                   <wp:effectExtent l="0" t="0" r="0" b="0"/>
                   <wp:docPr id="7" name="Picture 7"/>
@@ -936,7 +936,7 @@
                 <w:noProof/>
               </w:rPr>
               <w:drawing>
-                <wp:inline distT="0" distB="0" distL="0" distR="0" wp14:anchorId="580C7B42" wp14:editId="71E16D1D">
+                <wp:inline distT="0" distB="0" distL="0" distR="0" wp14:anchorId="357916BC" wp14:editId="016A09AF">
                   <wp:extent cx="621792" cy="829056"/>
                   <wp:effectExtent l="0" t="0" r="0" b="0"/>
                   <wp:docPr id="8" name="Picture 8"/>
@@ -1309,31 +1309,31 @@
       </w:rPr>
     </w:lvl>
   </w:abstractNum>
-  <w:num w:numId="1" w16cid:durableId="59521306">
+  <w:num w:numId="1" w16cid:durableId="1010523136">
     <w:abstractNumId w:val="8"/>
   </w:num>
-  <w:num w:numId="2" w16cid:durableId="1635791912">
+  <w:num w:numId="2" w16cid:durableId="1466657299">
     <w:abstractNumId w:val="6"/>
   </w:num>
-  <w:num w:numId="3" w16cid:durableId="133721180">
+  <w:num w:numId="3" w16cid:durableId="554851345">
     <w:abstractNumId w:val="5"/>
   </w:num>
-  <w:num w:numId="4" w16cid:durableId="2114207037">
+  <w:num w:numId="4" w16cid:durableId="1833984278">
     <w:abstractNumId w:val="4"/>
   </w:num>
-  <w:num w:numId="5" w16cid:durableId="635837827">
+  <w:num w:numId="5" w16cid:durableId="1562669407">
     <w:abstractNumId w:val="7"/>
   </w:num>
-  <w:num w:numId="6" w16cid:durableId="100227388">
+  <w:num w:numId="6" w16cid:durableId="498467484">
     <w:abstractNumId w:val="3"/>
   </w:num>
-  <w:num w:numId="7" w16cid:durableId="1515925155">
+  <w:num w:numId="7" w16cid:durableId="1195466179">
     <w:abstractNumId w:val="2"/>
   </w:num>
-  <w:num w:numId="8" w16cid:durableId="1273702540">
+  <w:num w:numId="8" w16cid:durableId="1020546039">
     <w:abstractNumId w:val="1"/>
   </w:num>
-  <w:num w:numId="9" w16cid:durableId="814495418">
+  <w:num w:numId="9" w16cid:durableId="1990091367">
     <w:abstractNumId w:val="0"/>
   </w:num>
 </w:numbering>
@@ -12724,7 +12724,7 @@
     <w:autoRedefine/>
     <w:uiPriority w:val="39"/>
     <w:unhideWhenUsed/>
-    <w:rsid w:val="00311BE6"/>
+    <w:rsid w:val="00C2560D"/>
     <w:pPr>
       <w:spacing w:after="100"/>
     </w:pPr>
@@ -12734,7 +12734,7 @@
     <w:basedOn w:val="Fontepargpadro"/>
     <w:uiPriority w:val="99"/>
     <w:unhideWhenUsed/>
-    <w:rsid w:val="00311BE6"/>
+    <w:rsid w:val="00C2560D"/>
     <w:rPr>
       <w:color w:val="0000FF" w:themeColor="hyperlink"/>
       <w:u w:val="single"/>

</xml_diff>